<commit_message>
v3.0.2: currency-hedging labels, point-in-time shelf follows the swap gate, stale documents (#3)
Co-Authored-By: Claude Opus 5.5 <noreply@anthropic.com>
</commit_message>
<xml_diff>
--- a/docs/paper/Robo-Kit_v3_Paper.docx
+++ b/docs/paper/Robo-Kit_v3_Paper.docx
@@ -165,7 +165,7 @@
         <w:t xml:space="preserve">Return.</w:t>
       </w:r>
       <w:r>
-        <w:t xml:space="preserve"> No Sharpe-ratio comparison was conclusive after adjustment, as the power statement written before the run expected; in Canada the engine was shown not worse than a static mix by more than 0.10 at levels 3 and 4, the second only at the registered one-sided 5%.</w:t>
+        <w:t xml:space="preserve"> No Sharpe-ratio comparison was conclusive after adjustment, as the power statement written before the run expected; in Canada the engine was shown not worse than a static mix by more than 0.10 at levels 3 and 4, the second only at the registered one-sided 5% and not after a fund label corrected later (Section 6.9).</w:t>
       </w:r>
     </w:p>
     <w:p>
@@ -205,7 +205,7 @@
         <w:t xml:space="preserve">After the run.</w:t>
       </w:r>
       <w:r>
-        <w:t xml:space="preserve"> Audits found a fund-swap gate that was too permissive and 52 smaller defects. Those in the product were fixed without changing any evaluated portfolio; three in the evaluation's statistics are disclosed (Section 6.9). No crisis replay covers the 2000-2002 bear market.</w:t>
+        <w:t xml:space="preserve"> Audits found a fund-swap gate that was too permissive and 52 smaller defects. Those in the product were fixed without changing any evaluated portfolio; three in the evaluation's statistics are disclosed (Section 6.9). A later review found the Canadian gold fund's currency hedging mislabelled, which does touch the evaluated portfolios; a re-run with the label corrected is reported beside the registered results. No crisis replay covers the 2000-2002 bear market.</w:t>
       </w:r>
     </w:p>
     <w:p>
@@ -378,7 +378,7 @@
         <w:t xml:space="preserve">Returns.</w:t>
       </w:r>
       <w:r>
-        <w:t xml:space="preserve"> Monthly total returns come from dividend- and split-adjusted month-end closes (Yahoo Finance), so they are net of each fund's fee; the month in progress is dropped and gaps stay gaps. Funds that trade in another currency are converted at month-end exchange rates. Cash earns last month's 3-month bill yield over 12 (Bank of Canada series V80691344; the US 13-week bill), which is also the risk-free rate. A fund younger than the estimation window is extended back with a written stand-in that overlaps it for at least 24 months with a correlation of at least 0.8 and matches its currency hedging; each extension is disclosed with every result. The data end on 2026-08-31.</w:t>
+        <w:t xml:space="preserve"> Monthly total returns come from dividend- and split-adjusted month-end closes (Yahoo Finance), so they are net of each fund's fee; the month in progress is dropped and gaps stay gaps. Funds that trade in another currency are converted at month-end exchange rates. Cash earns last month's 3-month bill yield over 12 (Bank of Canada series V80691344; the US 13-week bill), which is also the risk-free rate. A fund younger than the estimation window is extended back with a written stand-in that overlaps it for at least 24 months with a correlation of at least 0.8 and matches its currency hedging (in the registered run one gold fund's hedging was mislabelled; Section 6.9); each extension is disclosed with every result. The data end on 2026-08-31.</w:t>
       </w:r>
     </w:p>
     <w:p>
@@ -6540,7 +6540,7 @@
         <w:t xml:space="preserve">Risk delivery: close to target, reading inconclusive.</w:t>
       </w:r>
       <w:r>
-        <w:t xml:space="preserve"> Realised volatility was 1.04, 1.03 and 0.99 times the target at levels 2 to 4, every point estimate inside [0.80, 1.25], but two of the simultaneous 90% intervals ([0.83, 1.26], [0.82, 1.26] and [0.80, 1.21]) reach just past the upper edge, so the registered reading is "inconclusive". The rule is demanding: the run's own simulation shows that for a mix delivering its target exactly, three such intervals on 120 months all fall inside the band only 66% of the time. Levels 1 and 5 had ratios of 1.06 and 0.93, and on the regulator's scale the realised paths rate Low at level 2, Low to medium at level 3 and Low to medium at level 4.</w:t>
+        <w:t xml:space="preserve"> Realised volatility was 1.04, 1.03 and 0.99 times the target at levels 2 to 4, every point estimate inside [0.80, 1.25], but two of the simultaneous 90% intervals ([0.83, 1.26], [0.82, 1.26] and [0.80, 1.21]) reach just past the upper edge, so the registered reading is "inconclusive". The rule is demanding: the run's own simulation shows that for a mix delivering its target exactly, three such intervals on 120 months all fall inside the band only 66% of the time; the Canadian sample is longer (200 months), so there the rule is somewhat less strict than that figure suggests. Levels 1 and 5 had ratios of 1.06 and 0.93, and on the regulator's scale the realised paths rate Low at level 2, Low to medium at level 3 and Low to medium at level 4.</w:t>
       </w:r>
     </w:p>
     <w:p>
@@ -9508,7 +9508,7 @@
         <w:t xml:space="preserve">No difference in risk-adjusted return was detected</w:t>
       </w:r>
       <w:r>
-        <w:t xml:space="preserve">, as the power statement expected. Against the static mix, Robo-Kit is shown not worse by more than 0.10 at levels 3 and 4 (adjusted non-inferiority p = 0.007 and 0.037), although at level 4 the adjusted p clears the registered 5% but not a stricter 2.5% (Section 5.2); at level 2 the unadjusted interval also clears the margin, but the adjusted p is 0.09. Against the textbook optimizer and risk parity it is ahead by amounts too small to settle with the data that exist (87,411 months needed at level 3 against the textbook). Against minimum variance it is ahead by about 0.6 a year, but that comparison is noisy and not like for like: unlevered risk parity and minimum variance are less volatile than even the level-2 target, so 100 of their 102 builds could not reach it, and they held the same portfolio at every level.</w:t>
+        <w:t xml:space="preserve">, as the power statement expected. Against the static mix, Robo-Kit is shown not worse by more than 0.10 at levels 3 and 4 (adjusted non-inferiority p = 0.007 and 0.037), although at level 4 the adjusted p clears the registered 5% but not a stricter 2.5% (Section 5.2), and with the gold fund's corrected currency label it rises to 0.059 (Section 6.9); at level 2 the unadjusted interval also clears the margin, but the adjusted p is 0.09. Against the textbook optimizer and risk parity it is ahead by amounts too small to settle with the data that exist (87,411 months needed at level 3 against the textbook). Against minimum variance it is ahead by about 0.6 a year, but that comparison is noisy and not like for like: unlevered risk parity and minimum variance are less volatile than even the level-2 target, so 100 of their 102 builds could not reach it, and they held the same portfolio at every level.</w:t>
       </w:r>
     </w:p>
     <w:p>
@@ -12613,7 +12613,7 @@
         <w:jc w:val="both"/>
       </w:pPr>
       <w:r>
-        <w:t xml:space="preserve">Counting every configuration the project's back-tests have tried (54), the deflated Sharpe ratio at level 3 is 0.98: the Sharpe ratio is very likely positive after allowing for the search, which is not the same as beating the benchmarks.</w:t>
+        <w:t xml:space="preserve">Counting every configuration the project's back-tests have tried (54), the deflated Sharpe ratio at level 3 is 0.98: the Sharpe ratio is very likely positive after allowing for the search, which is not the same as beating the benchmarks. The figure is, if anything, too favourable: the spread of all 54 configurations is estimated from the 13 strategies of this run, because the earlier ones cannot be recomputed on these months.</w:t>
       </w:r>
     </w:p>
     <w:p>
@@ -13749,7 +13749,7 @@
         <w:jc w:val="both"/>
       </w:pPr>
       <w:r>
-        <w:t xml:space="preserve">At the latest date, the level-3 Canadian mix moved by at most 0.2 points with a 3-month block and 2.7 with a 120-month window, and by 16 with no home bias, as a change of policy should. No home bias would have given a walk-forward Sharpe ratio of 0.97 against 0.92, as Canadian stocks lagged; choosing the home share from that would be fitting the past. The caps, the per-fund maximum and the data-driven block length (Politis and White 2004) changed nothing, and </w:t>
+        <w:t xml:space="preserve">At the latest date, the level-3 Canadian mix moved by at most 0.2 points with a 3-month block and 2.7 with a 120-month window, and by 16 with no home bias, as a change of policy should. No home bias would have given a walk-forward Sharpe ratio of 0.97 against 0.92, as Canadian stocks lagged; choosing the home share from that would be fitting the past. Halving or doubling the slot caps (the cash cap was not varied), a per-fund maximum of 35% or 70% and the data-driven block length (Politis and White 2004) changed nothing, and </w:t>
       </w:r>
       <m:oMath>
         <m:r>
@@ -13850,7 +13850,7 @@
         <w:t xml:space="preserve">Audits after the run.</w:t>
       </w:r>
       <w:r>
-        <w:t xml:space="preserve"> Three registered checks ran outside the evaluation script (reports in docs/research). Against the issuers' published five-year returns, 15 of 17 comparable reference funds agreed within 0.05 points a year, and the largest gaps (up to 0.31) have known causes. Each slot's top candidates are broad, low-cost index funds, except that the Canadian global-bond slot holds a US-only fund. And 140 funds labelled blind from the issuers' pages showed the fund-swap gate to be too permissive: of 18 sampled stock funds the engine called broad, only one was, so a client could have swapped a sector or single-country fund into a broad slot. The gate now requires the slot's own selection rule and a like-for-like label; on a held-out sample, 29 of 30 narrow and 26 of 30 broad labels agree with the issuers.</w:t>
+        <w:t xml:space="preserve"> Three registered checks ran outside the evaluation script (reports in docs/research). Against the issuers' published five-year returns, 14 of 17 comparable reference funds agreed within 0.05 points a year. The largest gap, VALT's 1.20 points, is mostly the difference between its market price and its net asset value; the cause of XIC's and XRE's (0.31 and 0.25 points below) is not established, and it understates their returns slightly but not their risk. Each slot's top candidates are broad, low-cost index funds, except that the Canadian global-bond slot holds a US-only fund. And 140 funds labelled blind from the issuers' pages showed the fund-swap gate to be too permissive: of 18 sampled stock funds the engine called broad, only one was, so a client could have swapped a sector or single-country fund into a broad slot. The gate now requires the slot's own selection rule and a like-for-like label; on a held-out sample, 29 of 30 narrow and 26 of 30 broad labels agree with the issuers.</w:t>
       </w:r>
     </w:p>
     <w:p>
@@ -13895,6 +13895,22 @@
       </w:r>
       <w:r>
         <w:t xml:space="preserve"> After the paper's examination, six AI finders searched the code by running it, one per area, and an independent verifier re-ran each finding and tried to refute it. Both were of the author's own model family (the others' usage limits had been reached), so this is weaker evidence of independence than the examinations, but every finding was reproduced. Of 53 findings, 52 were true. Most were in the product (requests that should have been refused or flagged, numerical edge cases, differences between the two engines, the rebalancer, fund labels) and were fixed with regression tests, except one kept as a limitation (Section 7); five concerned the evaluation code, including the three points of Section 5.2. Re-running the whole evaluation on the corrected code (output/v3_verify, compared value by value by scripts/v3_verify_rerun.py) changed only what these points predict, chiefly the textbook optimizer's rows; Robo-Kit's own results and every other benchmark's were unchanged to the last digit. Every finding and ruling is in docs/DECISIONS.md.</w:t>
+      </w:r>
+    </w:p>
+    <w:p>
+      <w:pPr>
+        <w:spacing w:after="120" w:line="276"/>
+        <w:jc w:val="both"/>
+      </w:pPr>
+      <w:r>
+        <w:rPr>
+          <w:b/>
+          <w:bCs/>
+        </w:rPr>
+        <w:t xml:space="preserve">A mislabelled gold fund.</w:t>
+      </w:r>
+      <w:r>
+        <w:t xml:space="preserve"> A later review, of the team's optimizer report, found that VALT, the Canadian gold fund, is its issuer's CAD-hedged unit (the unhedged unit is VALT.B) but was labelled unhedged, because its name carries no hedging word. The engine therefore extended it back to 2004 with unhedged gold (CGL-C, then GLD converted to Canadian dollars), where the stand-in rule calls for gold in US dollars, unconverted, which also tracks VALT's own returns more closely (correlation 0.986, against 0.917 and 0.926 for the registered stand-ins). A search of the fund list against issuers' documents found 36 other hedging labels the name rule got wrong, none on either reference shelf; all were corrected in version 3.0.2. Unlike the swap-gate fix, this one touches the evaluated path: E1 and E8(a) in Canada use VALT's stand-in. E2 does not, but one of the corrected funds, HUG, was its only Canadian gold fund with 36 months of its own history from 2012 to 2022; HUG tracks gold futures, so the swap gate now refuses it and the point-in-time shelf leaves gold out in those years (the registered E2's level-3 mixes held it in 2012 to 2015; E2 was not re-run). Re-running E1 Canada with only VALT relabelled, on the universe the registered run used (output/v3_valt_check, scripts/v3_valt_check.py; not a registered run), leaves realised over target volatility at 1.04, 1.03 and 1.00 ("inconclusive") and lowers Robo-Kit's Sharpe ratios by 0.005 to 0.010. One reading changes: against the static mix at level 4 the adjusted non-inferiority p becomes 0.059, so that comparison is "inconclusive"; at level 3 it stays "not worse by more than 0.10" (p = 0.014). The registered results are reported as registered. The simulation's truth (E3) also contains VALT's stand-in before 2010 but was not re-run; its two decisions sat far from their thresholds (Section 6.1).</w:t>
       </w:r>
     </w:p>
     <w:p>
@@ -14004,7 +14020,7 @@
         <w:t xml:space="preserve">Data and labels.</w:t>
       </w:r>
       <w:r>
-        <w:t xml:space="preserve"> Prices and fund data come from Yahoo Finance and TMX for personal, non-commercial use. Labels that let a fund into the wrong slot were corrected after the run (Section 6.9); other label errors remain, listed in docs/research/e7e_taxonomy.md.</w:t>
+        <w:t xml:space="preserve"> Prices and fund data come from Yahoo Finance and TMX for personal, non-commercial use. Labels that let a fund into the wrong slot, and one that gave the gold fund the wrong stand-in, were corrected after the run (Section 6.9); other label errors remain, listed in docs/research/e7e_taxonomy.md.</w:t>
       </w:r>
     </w:p>
     <w:p>
@@ -14044,7 +14060,7 @@
         <w:t xml:space="preserve">Examiners.</w:t>
       </w:r>
       <w:r>
-        <w:t xml:space="preserve"> All were AI models. Rounds 8 to 18 of the plan's review and the paper's review had one other model family, and the second audit used the author's own, because the others' usage limits were reached.</w:t>
+        <w:t xml:space="preserve"> All were AI models. Rounds 8 to 18 of the plan's review and the paper's review had one other model family, and the second audit, like the review that found the gold fund's label, used the author's own, because the others' usage limits were reached.</w:t>
       </w:r>
     </w:p>
     <w:p>
@@ -14112,7 +14128,7 @@
         <w:jc w:val="both"/>
       </w:pPr>
       <w:r>
-        <w:t xml:space="preserve">On risk, the answer depends on the market: within a few percent of target in Canada over sixteen years, though the registered reading is "inconclusive", and about a third above it in the US over a turbulent seven. On return, the evaluation could not show that the engine beats simple alternatives. When its expected returns were wrong in simulation, a static stock-bond mix lost slightly less, and in the Canadian walk-forward the engine was shown only not worse than that mix by more than 0.10. Both the US risk and the absence of a proven edge belong in what a client is told.</w:t>
+        <w:t xml:space="preserve">On risk, the answer depends on the market: within a few percent of target in Canada over sixteen years, though the registered reading is "inconclusive", and about a third above it in the US over a turbulent seven. On return, the evaluation could not show that the engine beats simple alternatives. When its expected returns were wrong in simulation, a static stock-bond mix lost slightly less, and in the Canadian walk-forward the engine was shown only not worse than that mix by more than 0.10, at level 3; at level 4 that reading does not survive the gold fund's corrected label. Both the US risk and the absence of a proven edge belong in what a client is told.</w:t>
       </w:r>
     </w:p>
     <w:p>

</xml_diff>